<commit_message>
Pose l'adresse de contact là où elle manquait encore
Les pages légales la portaient déjà ; la sonde de notifications annonçait aux
services de messagerie une adresse inventée, et la note au juriste comptait le
contact parmi les inconnues. Il ne reste que trois informations d'entreprise à
fournir : raison sociale, adresse du siège, et registre de commerce.

Co-Authored-By: Claude Opus 5 <noreply@anthropic.com>
</commit_message>
<xml_diff>
--- a/docs/juridique/v3-boutique-et-regles/NOTE-AU-JURISTE-v3.docx
+++ b/docs/juridique/v3-boutique-et-regles/NOTE-AU-JURISTE-v3.docx
@@ -1447,7 +1447,220 @@
         <w:t>mentions légales</w:t>
       </w:r>
       <w:r>
-        <w:t>, qui sont le seul des quatre documents que nous pourrions publier sans attendre votre relecture — raison sociale, adresse, registre de commerce, hébergeur, contact. Une page publiée sur quatre rendrait les trois notes d'attente crédibles.</w:t>
+        <w:t>, seul des quatre documents que nous pourrions publier sans attendre votre relecture. Une page publiée sur quatre rendrait les trois notes d'attente crédibles.</w:t>
+      </w:r>
+    </w:p>
+    <w:p>
+      <w:r>
+        <w:t>Il y manque quatre informations, dont une seule est désormais connue :</w:t>
+      </w:r>
+    </w:p>
+    <w:tbl>
+      <w:tblPr>
+        <w:tblStyle w:val="TableGrid"/>
+        <w:tblW w:type="auto" w:w="0"/>
+        <w:tblLook w:firstColumn="1" w:firstRow="1" w:lastColumn="0" w:lastRow="0" w:noHBand="0" w:noVBand="1" w:val="04A0"/>
+      </w:tblPr>
+      <w:tblGrid>
+        <w:gridCol w:w="4709"/>
+        <w:gridCol w:w="4709"/>
+      </w:tblGrid>
+      <w:tr>
+        <w:tc>
+          <w:tcPr>
+            <w:tcW w:type="dxa" w:w="4709"/>
+          </w:tcPr>
+          <w:p>
+            <w:r/>
+            <w:r>
+              <w:rPr>
+                <w:b/>
+                <w:color w:val="A34D1F"/>
+                <w:sz w:val="20"/>
+              </w:rPr>
+            </w:r>
+          </w:p>
+        </w:tc>
+        <w:tc>
+          <w:tcPr>
+            <w:tcW w:type="dxa" w:w="4709"/>
+          </w:tcPr>
+          <w:p>
+            <w:r/>
+            <w:r>
+              <w:rPr>
+                <w:b/>
+                <w:color w:val="A34D1F"/>
+                <w:sz w:val="20"/>
+              </w:rPr>
+            </w:r>
+          </w:p>
+        </w:tc>
+      </w:tr>
+      <w:tr>
+        <w:tc>
+          <w:tcPr>
+            <w:tcW w:type="dxa" w:w="4709"/>
+          </w:tcPr>
+          <w:p>
+            <w:r>
+              <w:rPr>
+                <w:sz w:val="20"/>
+              </w:rPr>
+            </w:r>
+            <w:r>
+              <w:rPr>
+                <w:sz w:val="20"/>
+              </w:rPr>
+              <w:t>Adresse de contact</w:t>
+            </w:r>
+          </w:p>
+        </w:tc>
+        <w:tc>
+          <w:tcPr>
+            <w:tcW w:type="dxa" w:w="4709"/>
+          </w:tcPr>
+          <w:p>
+            <w:r>
+              <w:rPr>
+                <w:sz w:val="20"/>
+              </w:rPr>
+            </w:r>
+            <w:r>
+              <w:rPr>
+                <w:b/>
+                <w:sz w:val="20"/>
+              </w:rPr>
+              <w:t>`contactsmavilla@gmail.com`</w:t>
+            </w:r>
+            <w:r>
+              <w:rPr>
+                <w:sz w:val="20"/>
+              </w:rPr>
+              <w:t xml:space="preserve"> — déjà en ligne sur les quatre pages</w:t>
+            </w:r>
+          </w:p>
+        </w:tc>
+      </w:tr>
+      <w:tr>
+        <w:tc>
+          <w:tcPr>
+            <w:tcW w:type="dxa" w:w="4709"/>
+          </w:tcPr>
+          <w:p>
+            <w:r>
+              <w:rPr>
+                <w:sz w:val="20"/>
+              </w:rPr>
+            </w:r>
+            <w:r>
+              <w:rPr>
+                <w:sz w:val="20"/>
+              </w:rPr>
+              <w:t>Raison sociale</w:t>
+            </w:r>
+          </w:p>
+        </w:tc>
+        <w:tc>
+          <w:tcPr>
+            <w:tcW w:type="dxa" w:w="4709"/>
+          </w:tcPr>
+          <w:p>
+            <w:r>
+              <w:rPr>
+                <w:sz w:val="20"/>
+              </w:rPr>
+            </w:r>
+            <w:r>
+              <w:rPr>
+                <w:sz w:val="20"/>
+              </w:rPr>
+              <w:t>à fournir</w:t>
+            </w:r>
+          </w:p>
+        </w:tc>
+      </w:tr>
+      <w:tr>
+        <w:tc>
+          <w:tcPr>
+            <w:tcW w:type="dxa" w:w="4709"/>
+          </w:tcPr>
+          <w:p>
+            <w:r>
+              <w:rPr>
+                <w:sz w:val="20"/>
+              </w:rPr>
+            </w:r>
+            <w:r>
+              <w:rPr>
+                <w:sz w:val="20"/>
+              </w:rPr>
+              <w:t>Adresse du siège</w:t>
+            </w:r>
+          </w:p>
+        </w:tc>
+        <w:tc>
+          <w:tcPr>
+            <w:tcW w:type="dxa" w:w="4709"/>
+          </w:tcPr>
+          <w:p>
+            <w:r>
+              <w:rPr>
+                <w:sz w:val="20"/>
+              </w:rPr>
+            </w:r>
+            <w:r>
+              <w:rPr>
+                <w:sz w:val="20"/>
+              </w:rPr>
+              <w:t>à fournir</w:t>
+            </w:r>
+          </w:p>
+        </w:tc>
+      </w:tr>
+      <w:tr>
+        <w:tc>
+          <w:tcPr>
+            <w:tcW w:type="dxa" w:w="4709"/>
+          </w:tcPr>
+          <w:p>
+            <w:r>
+              <w:rPr>
+                <w:sz w:val="20"/>
+              </w:rPr>
+            </w:r>
+            <w:r>
+              <w:rPr>
+                <w:sz w:val="20"/>
+              </w:rPr>
+              <w:t>Registre de commerce (RCCM) et NINEA</w:t>
+            </w:r>
+          </w:p>
+        </w:tc>
+        <w:tc>
+          <w:tcPr>
+            <w:tcW w:type="dxa" w:w="4709"/>
+          </w:tcPr>
+          <w:p>
+            <w:r>
+              <w:rPr>
+                <w:sz w:val="20"/>
+              </w:rPr>
+            </w:r>
+            <w:r>
+              <w:rPr>
+                <w:sz w:val="20"/>
+              </w:rPr>
+              <w:t>à fournir</w:t>
+            </w:r>
+          </w:p>
+        </w:tc>
+      </w:tr>
+    </w:tbl>
+    <w:p/>
+    <w:p>
+      <w:r>
+        <w:t>L'hébergeur, lui, est connu : le site est servi par Render, l'interface applicative par Railway, tous deux hors du Sénégal. Si cela appelle une mention particulière sur le transfert de données, dites-le nous.</w:t>
       </w:r>
     </w:p>
     <w:p>

</xml_diff>